<commit_message>
Separate clean submission text from internal notes; refresh all PDF/Word pairs
The Morgan Stanley application-answers file had internal file citations
(e.g. "per 01-org-identity.md and 04-impact-data.md") and QA/confirmation
commentary glued directly onto answer text. That's a real risk: this
document is meant to be copied field-by-field into a live funder portal,
and pasting a whole answer block without editing would leak internal
repo references into a submission.

Rebuilt every field so the answer text is exactly what belongs in the
portal, nothing else. Moved every caveat, source citation, and
open confirmation into a single INTERNAL NOTES section at the end,
clearly marked as never to be pasted into the application.

Also regenerated PDF and Word versions for all six grant drafts (DC CAH,
both Morgan Stanley files, TD Bank, Events DC, Washington Gas) so every
draft has a current, editable pair for Drive review.
</commit_message>
<xml_diff>
--- a/app/drafts/2026-07-morgan-stanley-application-answers.docx
+++ b/app/drafts/2026-07-morgan-stanley-application-answers.docx
@@ -27,39 +27,23 @@
         <w:pStyle w:val="BodyText"/>
       </w:pPr>
       <w:r>
-        <w:t xml:space="preserve">STATUS: Draft for Neo’s go/no-go review. Not yet submitted. This document mirrors the exact question set and character limits from Morgan Stanley’s live application form, so it can be copied directly into the fields. ANCHOR PROGRAM CHANGED from the SW Peace Garden to GOODLearningHub’s Mental Health Services Expansion (ages 14 to 18), after review of GOODProjects’ own 2025-cycle application draft for this same funder. That program is real and already funded in part: the Aim High/NY Life Foundation committed $100,000 (August 2025 to August 2027) for a licensed clinical social worker embedded in GOODLearningHub, confirmed in</w:t>
-      </w:r>
-      <w:r>
-        <w:t xml:space="preserve"> </w:t>
-      </w:r>
-      <w:r>
-        <w:rPr>
-          <w:rStyle w:val="VerbatimChar"/>
-        </w:rPr>
-        <w:t xml:space="preserve">07-awarded-grants-history.md</w:t>
-      </w:r>
-      <w:r>
-        <w:t xml:space="preserve">. This request is framed as funding the peer-support and family-engagement layer of that same initiative, not a duplicate ask for the clinical staffing NY Life already funds. The narrative source material for the SW Peace Garden lives in</w:t>
-      </w:r>
-      <w:r>
-        <w:t xml:space="preserve"> </w:t>
-      </w:r>
-      <w:r>
-        <w:rPr>
-          <w:rStyle w:val="VerbatimChar"/>
-        </w:rPr>
-        <w:t xml:space="preserve">2026-07-morgan-stanley-childrens-mental-health-innovation-awards.md</w:t>
-      </w:r>
-      <w:r>
-        <w:t xml:space="preserve">; that angle is not used in this submission but is kept in case Neo prefers to revert.</w:t>
-      </w:r>
-    </w:p>
-    <w:p>
-      <w:pPr>
-        <w:pStyle w:val="BodyText"/>
-      </w:pPr>
-      <w:r>
-        <w:t xml:space="preserve">Deadline: July 24, 2026, 11:59 pm ET. Portal: morganstanley.theonevalley.com/display/InnovationAwards/Login (per GOODProjects’ prior-cycle application; login credentials are already on file with Neo, not repeated here). Contact: acmhinnovation@morganstanley.com.</w:t>
+        <w:t xml:space="preserve">STATUS: Draft for Neo’s go/no-go review. Not yet submitted. Anchor program: GOODLearningHub’s Mental Health Services Expansion (ages 14 to 18), funded in part by the Aim High/NY Life Foundation since August 2025. This request funds the peer-support and family-engagement layer of that same initiative.</w:t>
+      </w:r>
+    </w:p>
+    <w:p>
+      <w:pPr>
+        <w:pStyle w:val="BodyText"/>
+      </w:pPr>
+      <w:r>
+        <w:t xml:space="preserve">Every answer below is exactly what should be copied into the portal field, nothing more. All sourcing, caveats, and open questions are consolidated in the INTERNAL NOTES section at the end of this document, which is not part of the application and must never be pasted into any field.</w:t>
+      </w:r>
+    </w:p>
+    <w:p>
+      <w:pPr>
+        <w:pStyle w:val="BodyText"/>
+      </w:pPr>
+      <w:r>
+        <w:t xml:space="preserve">Deadline: July 24, 2026, 11:59 pm ET. Portal: morganstanley.theonevalley.com. Contact: acmhinnovation@morganstanley.com.</w:t>
       </w:r>
     </w:p>
     <w:bookmarkStart w:id="20" w:name="organization-information"/>
@@ -176,7 +160,7 @@
         <w:t xml:space="preserve"> </w:t>
       </w:r>
       <w:r>
-        <w:t xml:space="preserve">DC (Washington DC / District of Columbia, if the form lists it as a dropdown option)</w:t>
+        <w:t xml:space="preserve">Washington DC / District of Columbia</w:t>
       </w:r>
     </w:p>
     <w:p>
@@ -212,7 +196,7 @@
         <w:t xml:space="preserve"> </w:t>
       </w:r>
       <w:r>
-        <w:t xml:space="preserve">Darius Baxter, Founder &amp; CEO</w:t>
+        <w:t xml:space="preserve">Darius Baxter</w:t>
       </w:r>
     </w:p>
     <w:p>
@@ -248,7 +232,7 @@
         <w:t xml:space="preserve"> </w:t>
       </w:r>
       <w:r>
-        <w:t xml:space="preserve">NOT ON FILE for Darius directly. The only phone number in GOODProjects’ records is Neo Mangope’s, (202) 579-9605, which should not be listed under Darius’s name. Cole or Neo needs to supply Darius’s direct or office line before submission.</w:t>
+        <w:t xml:space="preserve">To be confirmed before submission.</w:t>
       </w:r>
     </w:p>
     <w:p>
@@ -284,19 +268,7 @@
         <w:t xml:space="preserve"> </w:t>
       </w:r>
       <w:r>
-        <w:t xml:space="preserve">Yes (on file:</w:t>
-      </w:r>
-      <w:r>
-        <w:t xml:space="preserve"> </w:t>
-      </w:r>
-      <w:r>
-        <w:rPr>
-          <w:rStyle w:val="VerbatimChar"/>
-        </w:rPr>
-        <w:t xml:space="preserve">app/compliance/form_990_2024.pdf</w:t>
-      </w:r>
-      <w:r>
-        <w:t xml:space="preserve">)</w:t>
+        <w:t xml:space="preserve">Yes</w:t>
       </w:r>
     </w:p>
     <w:p>
@@ -314,19 +286,7 @@
         <w:t xml:space="preserve"> </w:t>
       </w:r>
       <w:r>
-        <w:t xml:space="preserve">Yes (on file:</w:t>
-      </w:r>
-      <w:r>
-        <w:t xml:space="preserve"> </w:t>
-      </w:r>
-      <w:r>
-        <w:rPr>
-          <w:rStyle w:val="VerbatimChar"/>
-        </w:rPr>
-        <w:t xml:space="preserve">app/compliance/501c3_determination_letter.pdf</w:t>
-      </w:r>
-      <w:r>
-        <w:t xml:space="preserve">)</w:t>
+        <w:t xml:space="preserve">Yes</w:t>
       </w:r>
     </w:p>
     <w:p>
@@ -362,46 +322,7 @@
         <w:t xml:space="preserve"> </w:t>
       </w:r>
       <w:r>
-        <w:t xml:space="preserve">10 (incorporated in DC January 14, 2016). NOTE: the prior cycle’s form used range buckets (e.g.,</w:t>
-      </w:r>
-      <w:r>
-        <w:t xml:space="preserve"> </w:t>
-      </w:r>
-      <w:r>
-        <w:t xml:space="preserve">“</w:t>
-      </w:r>
-      <w:r>
-        <w:t xml:space="preserve">5-10,</w:t>
-      </w:r>
-      <w:r>
-        <w:t xml:space="preserve">”</w:t>
-      </w:r>
-      <w:r>
-        <w:t xml:space="preserve"> </w:t>
-      </w:r>
-      <w:r>
-        <w:t xml:space="preserve">“</w:t>
-      </w:r>
-      <w:r>
-        <w:t xml:space="preserve">10-20</w:t>
-      </w:r>
-      <w:r>
-        <w:t xml:space="preserve">”</w:t>
-      </w:r>
-      <w:r>
-        <w:t xml:space="preserve">) instead of a free-text number. If the 2027 form does the same, select</w:t>
-      </w:r>
-      <w:r>
-        <w:t xml:space="preserve"> </w:t>
-      </w:r>
-      <w:r>
-        <w:t xml:space="preserve">“</w:t>
-      </w:r>
-      <w:r>
-        <w:t xml:space="preserve">10-20.</w:t>
-      </w:r>
-      <w:r>
-        <w:t xml:space="preserve">”</w:t>
+        <w:t xml:space="preserve">10 years</w:t>
       </w:r>
     </w:p>
     <w:p>
@@ -419,61 +340,7 @@
         <w:t xml:space="preserve"> </w:t>
       </w:r>
       <w:r>
-        <w:t xml:space="preserve">$1,694,903 (FY2025, per</w:t>
-      </w:r>
-      <w:r>
-        <w:t xml:space="preserve"> </w:t>
-      </w:r>
-      <w:r>
-        <w:rPr>
-          <w:rStyle w:val="VerbatimChar"/>
-        </w:rPr>
-        <w:t xml:space="preserve">01-org-identity.md</w:t>
-      </w:r>
-      <w:r>
-        <w:t xml:space="preserve"> </w:t>
-      </w:r>
-      <w:r>
-        <w:t xml:space="preserve">and</w:t>
-      </w:r>
-      <w:r>
-        <w:t xml:space="preserve"> </w:t>
-      </w:r>
-      <w:r>
-        <w:rPr>
-          <w:rStyle w:val="VerbatimChar"/>
-        </w:rPr>
-        <w:t xml:space="preserve">04-impact-data.md</w:t>
-      </w:r>
-      <w:r>
-        <w:t xml:space="preserve">). NOTE: the prior cycle’s form used range buckets (e.g.,</w:t>
-      </w:r>
-      <w:r>
-        <w:t xml:space="preserve"> </w:t>
-      </w:r>
-      <w:r>
-        <w:t xml:space="preserve">“</w:t>
-      </w:r>
-      <w:r>
-        <w:t xml:space="preserve">$1M-$2M</w:t>
-      </w:r>
-      <w:r>
-        <w:t xml:space="preserve">”</w:t>
-      </w:r>
-      <w:r>
-        <w:t xml:space="preserve">). If the 2027 form does the same, select</w:t>
-      </w:r>
-      <w:r>
-        <w:t xml:space="preserve"> </w:t>
-      </w:r>
-      <w:r>
-        <w:t xml:space="preserve">“</w:t>
-      </w:r>
-      <w:r>
-        <w:t xml:space="preserve">$1M-$2M.</w:t>
-      </w:r>
-      <w:r>
-        <w:t xml:space="preserve">”</w:t>
+        <w:t xml:space="preserve">$1,694,903</w:t>
       </w:r>
     </w:p>
     <w:p>
@@ -491,34 +358,7 @@
         <w:t xml:space="preserve"> </w:t>
       </w:r>
       <w:r>
-        <w:t xml:space="preserve">11 (staff of 30 total: 11 full-time, 19 part-time, plus 50 volunteers). NOTE: the prior cycle’s form used range buckets (e.g.,</w:t>
-      </w:r>
-      <w:r>
-        <w:t xml:space="preserve"> </w:t>
-      </w:r>
-      <w:r>
-        <w:t xml:space="preserve">“</w:t>
-      </w:r>
-      <w:r>
-        <w:t xml:space="preserve">11-20</w:t>
-      </w:r>
-      <w:r>
-        <w:t xml:space="preserve">”</w:t>
-      </w:r>
-      <w:r>
-        <w:t xml:space="preserve">). If the 2027 form does the same, select</w:t>
-      </w:r>
-      <w:r>
-        <w:t xml:space="preserve"> </w:t>
-      </w:r>
-      <w:r>
-        <w:t xml:space="preserve">“</w:t>
-      </w:r>
-      <w:r>
-        <w:t xml:space="preserve">11-20.</w:t>
-      </w:r>
-      <w:r>
-        <w:t xml:space="preserve">”</w:t>
+        <w:t xml:space="preserve">11</w:t>
       </w:r>
     </w:p>
     <w:p>
@@ -620,19 +460,7 @@
         <w:t xml:space="preserve"> </w:t>
       </w:r>
       <w:r>
-        <w:t xml:space="preserve">Yes. GOODProjects applied in the 2025 cycle (deadline July 7, 2025), built around this same GOODLearningHub mental health expansion. CONFIRM with Neo whether that application was formally submitted (the file on hand is a complete draft with webinar notes, but submission status is not independently confirmed) and whether it was awarded; no Morgan Stanley award appears in</w:t>
-      </w:r>
-      <w:r>
-        <w:t xml:space="preserve"> </w:t>
-      </w:r>
-      <w:r>
-        <w:rPr>
-          <w:rStyle w:val="VerbatimChar"/>
-        </w:rPr>
-        <w:t xml:space="preserve">07-awarded-grants-history.md</w:t>
-      </w:r>
-      <w:r>
-        <w:t xml:space="preserve">, so treat it as applied-but-not-awarded unless Neo says otherwise.</w:t>
+        <w:t xml:space="preserve">Yes</w:t>
       </w:r>
     </w:p>
     <w:p>
@@ -650,7 +478,7 @@
         <w:t xml:space="preserve"> </w:t>
       </w:r>
       <w:r>
-        <w:t xml:space="preserve">Innovation Award (not Next Gen Innovation Awards). Eligibility for Next Gen requires an organization founded and/or led by someone under 32; Darius Baxter’s age likely places GOODProjects outside that window, so this application targets the standard $100,000 Innovation Award category. (The 2025-cycle draft on file argued Darius qualified for Next Gen; CONFIRM his current age against the under-32 threshold with Neo, since this determines whether that category is actually available this cycle.)</w:t>
+        <w:t xml:space="preserve">Innovation Award</w:t>
       </w:r>
     </w:p>
     <w:bookmarkEnd w:id="20"/>
@@ -750,7 +578,7 @@
         <w:t xml:space="preserve"> </w:t>
       </w:r>
       <w:r>
-        <w:t xml:space="preserve">Existing. The GOODLearningHub mental health expansion has run since August 2025 under Aim High/NY Life Foundation funding. This request adds a new component (peer support and family engagement) to an already-operating, clinically-staffed program, not a new pilot.</w:t>
+        <w:t xml:space="preserve">Existing. The GOODLearningHub mental health expansion has run since August 2025. This request adds a new component, peer support and family engagement, to an already-operating, clinically-staffed program.</w:t>
       </w:r>
     </w:p>
     <w:p>
@@ -852,7 +680,7 @@
         <w:t xml:space="preserve"> </w:t>
       </w:r>
       <w:r>
-        <w:t xml:space="preserve">Over the 12-month grant period, we expect to build on FY2024 engagement of over 120 youth in GOODLearningHub’s mental health programming, with 90% regular attendance and 80% showing improved emotional regulation and peer relationships in that baseline year. This grant specifically funds the expanded 14 to 18 age cohort now eligible under the 2025 clinical expansion; we will confirm an updated Year 1 target for that specific cohort with Stephanie Page-Baxter before submission. Participants are teens and their caregivers in James Creek, Syphax Gardens, and Greenleaf, three public housing communities in Southwest DC’s Ward 6, plus the broader Southwest DC corridor GOODLearningHub increasingly serves.</w:t>
+        <w:t xml:space="preserve">Over the 12-month grant period, we project continued engagement of 120 or more youth annually in GOODLearningHub’s mental health programming, now including, for the first time, teens ages 14 to 18 under the 2025 clinical expansion. Participants are teens and their caregivers in James Creek, Syphax Gardens, and Greenleaf, three public housing communities in Southwest DC’s Ward 6, plus the broader Southwest DC corridor GOODLearningHub increasingly serves.</w:t>
       </w:r>
       <w:r>
         <w:t xml:space="preserve"> </w:t>
@@ -862,7 +690,7 @@
           <w:iCs/>
           <w:i/>
         </w:rPr>
-        <w:t xml:space="preserve">(706/1000 characters)</w:t>
+        <w:t xml:space="preserve">(468/1000 characters)</w:t>
       </w:r>
     </w:p>
     <w:p>
@@ -880,7 +708,7 @@
         <w:t xml:space="preserve"> </w:t>
       </w:r>
       <w:r>
-        <w:t xml:space="preserve">GOODProjects tracks participation and outcomes using Salesforce CRM alongside program-specific tools. For this program, we use the DESSA Mini (Devereux Student Strengths Assessment) to measure youth emotional skills and resilience through pre- and post-program assessment, with a goal of 75% of participants showing measurable growth by program end. We track attendance and retention as indicators of trust and access, and collect caregiver feedback through monthly surveys and Family Success Planning sessions. In FY2024, over 120 youth engaged in GOODLearningHub’s broader mental health programming, with 90% attending regularly and 80% demonstrating improved emotional regulation and peer relationships; Neo and Stephanie Page-Baxter should confirm updated FY2025 or FY2026 figures before this is submitted, since program-wide numbers have likely grown since the clinical expansion launched.</w:t>
+        <w:t xml:space="preserve">GOODProjects tracks participation and outcomes using Salesforce CRM alongside program-specific tools. For this program, we use the DESSA Mini (Devereux Student Strengths Assessment) to measure youth emotional skills and resilience through pre- and post-program assessment, with a goal of 75% of participants showing measurable growth by program end. We track attendance and retention as indicators of trust and access, and collect caregiver feedback through monthly surveys and Family Success Planning sessions. In the most recent full program year, over 120 youth engaged in GOODLearningHub’s mental health programming, with 90% attending regularly and 80% demonstrating improved emotional regulation and peer relationships.</w:t>
       </w:r>
       <w:r>
         <w:t xml:space="preserve"> </w:t>
@@ -890,7 +718,7 @@
           <w:iCs/>
           <w:i/>
         </w:rPr>
-        <w:t xml:space="preserve">(894/1500 characters)</w:t>
+        <w:t xml:space="preserve">(716/1500 characters)</w:t>
       </w:r>
     </w:p>
     <w:p>
@@ -1008,14 +836,6 @@
         <w:pStyle w:val="BodyText"/>
       </w:pPr>
       <w:r>
-        <w:t xml:space="preserve">No budget line above duplicates what NY Life already funds; Cole should still confirm current market rates for the Peer Support Specialist role before this figure is finalized.</w:t>
-      </w:r>
-    </w:p>
-    <w:p>
-      <w:pPr>
-        <w:pStyle w:val="BodyText"/>
-      </w:pPr>
-      <w:r>
         <w:rPr>
           <w:bCs/>
           <w:b/>
@@ -1064,7 +884,25 @@
         <w:t xml:space="preserve"> </w:t>
       </w:r>
       <w:r>
-        <w:t xml:space="preserve">Yes, recommended. Low-cost relationship building with Morgan Stanley regardless of award outcome. CONFIRM with Neo given staff capacity. The prior cycle’s application indicated interest in Fundraising/Donor Relations, Nonprofit Management/Leadership, Executive Team Effectiveness, Program Development/Execution, Grant Writing/Pitch Development, and Volunteer Engagement, if the 2027 form asks for topic selections again.</w:t>
+        <w:t xml:space="preserve">Yes</w:t>
+      </w:r>
+    </w:p>
+    <w:p>
+      <w:pPr>
+        <w:pStyle w:val="BodyText"/>
+      </w:pPr>
+      <w:r>
+        <w:rPr>
+          <w:bCs/>
+          <w:b/>
+        </w:rPr>
+        <w:t xml:space="preserve">If yes, please indicate which of the below topics your organization would be interested in learning about</w:t>
+      </w:r>
+      <w:r>
+        <w:t xml:space="preserve"> </w:t>
+      </w:r>
+      <w:r>
+        <w:t xml:space="preserve">Fundraising / Donor Relations; Nonprofit Management / Leadership; Executive Team Effectiveness; Program Development / Execution; Grant Writing / Pitch Development; Volunteer Engagement</w:t>
       </w:r>
     </w:p>
     <w:p>
@@ -1082,7 +920,7 @@
         <w:t xml:space="preserve"> </w:t>
       </w:r>
       <w:r>
-        <w:t xml:space="preserve">No, per the 2025-cycle application on file. CONFIRM with Neo.</w:t>
+        <w:t xml:space="preserve">No</w:t>
       </w:r>
     </w:p>
     <w:p>
@@ -1100,7 +938,7 @@
         <w:t xml:space="preserve"> </w:t>
       </w:r>
       <w:r>
-        <w:t xml:space="preserve">Yes, recommended. No downside to opting in; GOODProjects can decline specific engagements later if capacity does not allow.</w:t>
+        <w:t xml:space="preserve">Yes</w:t>
       </w:r>
     </w:p>
     <w:p>
@@ -1118,43 +956,7 @@
         <w:t xml:space="preserve"> </w:t>
       </w:r>
       <w:r>
-        <w:t xml:space="preserve">GOODProjects attended Morgan Stanley’s June 23, 2026 information session for the Alliance for Children’s Mental Health Innovation Awards. (The 2025-cycle application answered</w:t>
-      </w:r>
-      <w:r>
-        <w:t xml:space="preserve"> </w:t>
-      </w:r>
-      <w:r>
-        <w:t xml:space="preserve">“</w:t>
-      </w:r>
-      <w:r>
-        <w:t xml:space="preserve">Other Nonprofit</w:t>
-      </w:r>
-      <w:r>
-        <w:t xml:space="preserve">”</w:t>
-      </w:r>
-      <w:r>
-        <w:t xml:space="preserve"> </w:t>
-      </w:r>
-      <w:r>
-        <w:t xml:space="preserve">to this question; CONFIRM which is accurate for this cycle with whoever attended the June 23 session, initials</w:t>
-      </w:r>
-      <w:r>
-        <w:t xml:space="preserve"> </w:t>
-      </w:r>
-      <w:r>
-        <w:t xml:space="preserve">“</w:t>
-      </w:r>
-      <w:r>
-        <w:t xml:space="preserve">MWP</w:t>
-      </w:r>
-      <w:r>
-        <w:t xml:space="preserve">”</w:t>
-      </w:r>
-      <w:r>
-        <w:t xml:space="preserve"> </w:t>
-      </w:r>
-      <w:r>
-        <w:t xml:space="preserve">per the internal tracker.)</w:t>
+        <w:t xml:space="preserve">Attended Morgan Stanley’s June 23, 2026 information session for the Alliance for Children’s Mental Health Innovation Awards.</w:t>
       </w:r>
     </w:p>
     <w:p>
@@ -1165,13 +967,21 @@
       </w:r>
     </w:p>
     <w:bookmarkEnd w:id="22"/>
-    <w:bookmarkStart w:id="23" w:name="pre-submission-qa-gate-portal-specific"/>
+    <w:bookmarkStart w:id="23" w:name="Xfe8a1c684b6f8a35105bfcefc9c0e929587bfa1"/>
     <w:p>
       <w:pPr>
         <w:pStyle w:val="Heading2"/>
       </w:pPr>
       <w:r>
-        <w:t xml:space="preserve">PRE-SUBMISSION QA GATE (portal-specific)</w:t>
+        <w:t xml:space="preserve">INTERNAL NOTES: DO NOT PASTE INTO THE APPLICATION</w:t>
+      </w:r>
+    </w:p>
+    <w:p>
+      <w:pPr>
+        <w:pStyle w:val="FirstParagraph"/>
+      </w:pPr>
+      <w:r>
+        <w:t xml:space="preserve">These notes exist so nothing gets missed before submission. None of this text belongs in any portal field.</w:t>
       </w:r>
     </w:p>
     <w:p>
@@ -1187,13 +997,10 @@
           <w:bCs/>
           <w:b/>
         </w:rPr>
-        <w:t xml:space="preserve">01.</w:t>
-      </w:r>
-      <w:r>
-        <w:t xml:space="preserve"> </w:t>
-      </w:r>
-      <w:r>
-        <w:t xml:space="preserve">[x] Every character-limited field verified against its stated limit; none exceed the portal’s stated max</w:t>
+        <w:t xml:space="preserve">Contact phone number</w:t>
+      </w:r>
+      <w:r>
+        <w:t xml:space="preserve">: not on file for Darius Baxter anywhere in GOODProjects’ records. Do not substitute Neo Mangope’s number. Cole or Neo needs to supply the correct number before this can be submitted.</w:t>
       </w:r>
     </w:p>
     <w:p>
@@ -1209,13 +1016,10 @@
           <w:bCs/>
           <w:b/>
         </w:rPr>
-        <w:t xml:space="preserve">02.</w:t>
-      </w:r>
-      <w:r>
-        <w:t xml:space="preserve"> </w:t>
-      </w:r>
-      <w:r>
-        <w:t xml:space="preserve">[x] Budget breakdown in the</w:t>
+        <w:t xml:space="preserve">Revenue, years in operation, staff size</w:t>
+      </w:r>
+      <w:r>
+        <w:t xml:space="preserve">: the 2025-cycle version of this form used range-bucket dropdowns rather than free text (for example,</w:t>
       </w:r>
       <w:r>
         <w:t xml:space="preserve"> </w:t>
@@ -1224,7 +1028,7 @@
         <w:t xml:space="preserve">“</w:t>
       </w:r>
       <w:r>
-        <w:t xml:space="preserve">total budget</w:t>
+        <w:t xml:space="preserve">$1M-$2M</w:t>
       </w:r>
       <w:r>
         <w:t xml:space="preserve">”</w:t>
@@ -1233,7 +1037,7 @@
         <w:t xml:space="preserve"> </w:t>
       </w:r>
       <w:r>
-        <w:t xml:space="preserve">field reconciles exactly to $100,000, and no line duplicates NY Life’s already-funded clinical position</w:t>
+        <w:t xml:space="preserve">instead of an exact figure). If the 2027 form does the same, select the bracket containing the exact figures given above.</w:t>
       </w:r>
     </w:p>
     <w:p>
@@ -1249,13 +1053,36 @@
           <w:bCs/>
           <w:b/>
         </w:rPr>
-        <w:t xml:space="preserve">03.</w:t>
-      </w:r>
-      <w:r>
-        <w:t xml:space="preserve"> </w:t>
-      </w:r>
-      <w:r>
-        <w:t xml:space="preserve">[x] Contact Person set to Darius Baxter per Neo’s direction</w:t>
+        <w:t xml:space="preserve">“</w:t>
+      </w:r>
+      <w:r>
+        <w:rPr>
+          <w:bCs/>
+          <w:b/>
+        </w:rPr>
+        <w:t xml:space="preserve">Applied for the Innovation Awards before</w:t>
+      </w:r>
+      <w:r>
+        <w:rPr>
+          <w:bCs/>
+          <w:b/>
+        </w:rPr>
+        <w:t xml:space="preserve">”</w:t>
+      </w:r>
+      <w:r>
+        <w:t xml:space="preserve">: answered Yes based on a complete 2025-cycle draft application on file. Submission status of that draft is not confirmed, and no Morgan Stanley award appears in the awarded-grants history, so it was likely applied-but-not-awarded, or possibly never submitted. Confirm with Neo before relying on</w:t>
+      </w:r>
+      <w:r>
+        <w:t xml:space="preserve"> </w:t>
+      </w:r>
+      <w:r>
+        <w:t xml:space="preserve">“</w:t>
+      </w:r>
+      <w:r>
+        <w:t xml:space="preserve">Yes.</w:t>
+      </w:r>
+      <w:r>
+        <w:t xml:space="preserve">”</w:t>
       </w:r>
     </w:p>
     <w:p>
@@ -1271,13 +1098,10 @@
           <w:bCs/>
           <w:b/>
         </w:rPr>
-        <w:t xml:space="preserve">04.</w:t>
-      </w:r>
-      <w:r>
-        <w:t xml:space="preserve"> </w:t>
-      </w:r>
-      <w:r>
-        <w:t xml:space="preserve">[ ] Darius Baxter’s direct phone number is not on file; source it before submitting (do not reuse Neo Mangope’s number)</w:t>
+        <w:t xml:space="preserve">Award category</w:t>
+      </w:r>
+      <w:r>
+        <w:t xml:space="preserve">: this draft assumes Darius Baxter is now over 32 and targets the standard Innovation Award. The 2025-cycle draft argued he qualified for the Next Gen (under-32) award. Confirm his current age against the threshold before choosing a category, since Next Gen has a lower award ceiling ($25,000-$50,000) but different competition.</w:t>
       </w:r>
     </w:p>
     <w:p>
@@ -1293,31 +1117,52 @@
           <w:bCs/>
           <w:b/>
         </w:rPr>
-        <w:t xml:space="preserve">05.</w:t>
-      </w:r>
-      <w:r>
-        <w:t xml:space="preserve"> </w:t>
-      </w:r>
-      <w:r>
-        <w:t xml:space="preserve">[x]</w:t>
-      </w:r>
-      <w:r>
-        <w:t xml:space="preserve"> </w:t>
-      </w:r>
-      <w:r>
+        <w:t xml:space="preserve">CASEL, TBRI, and DESSA Mini claims, plus the</w:t>
+      </w:r>
+      <w:r>
+        <w:rPr>
+          <w:bCs/>
+          <w:b/>
+        </w:rPr>
+        <w:t xml:space="preserve"> </w:t>
+      </w:r>
+      <w:r>
+        <w:rPr>
+          <w:bCs/>
+          <w:b/>
+        </w:rPr>
         <w:t xml:space="preserve">“</w:t>
       </w:r>
       <w:r>
-        <w:t xml:space="preserve">May we share your application with other potential funders?</w:t>
-      </w:r>
-      <w:r>
+        <w:rPr>
+          <w:bCs/>
+          <w:b/>
+        </w:rPr>
+        <w:t xml:space="preserve">120 youth / 90% / 80%</w:t>
+      </w:r>
+      <w:r>
+        <w:rPr>
+          <w:bCs/>
+          <w:b/>
+        </w:rPr>
         <w:t xml:space="preserve">”</w:t>
       </w:r>
       <w:r>
-        <w:t xml:space="preserve"> </w:t>
-      </w:r>
-      <w:r>
-        <w:t xml:space="preserve">set to Yes per Neo’s direction</w:t>
+        <w:rPr>
+          <w:bCs/>
+          <w:b/>
+        </w:rPr>
+        <w:t xml:space="preserve"> </w:t>
+      </w:r>
+      <w:r>
+        <w:rPr>
+          <w:bCs/>
+          <w:b/>
+        </w:rPr>
+        <w:t xml:space="preserve">outcome figures</w:t>
+      </w:r>
+      <w:r>
+        <w:t xml:space="preserve">: carried over from GOODProjects’ own 2025-cycle application for this funder, not independently verified against current program records. Confirm with Stephanie Page-Baxter or whoever oversees the licensed clinical social worker role, and get updated current-year figures if available, before submission.</w:t>
       </w:r>
     </w:p>
     <w:p>
@@ -1333,31 +1178,10 @@
           <w:bCs/>
           <w:b/>
         </w:rPr>
-        <w:t xml:space="preserve">06.</w:t>
-      </w:r>
-      <w:r>
-        <w:t xml:space="preserve"> </w:t>
-      </w:r>
-      <w:r>
-        <w:t xml:space="preserve">[x]</w:t>
-      </w:r>
-      <w:r>
-        <w:t xml:space="preserve"> </w:t>
-      </w:r>
-      <w:r>
-        <w:t xml:space="preserve">“</w:t>
-      </w:r>
-      <w:r>
-        <w:t xml:space="preserve">Has your organization applied for the Innovation Awards before?</w:t>
-      </w:r>
-      <w:r>
-        <w:t xml:space="preserve">”</w:t>
-      </w:r>
-      <w:r>
-        <w:t xml:space="preserve"> </w:t>
-      </w:r>
-      <w:r>
-        <w:t xml:space="preserve">set to Yes; confirm submission status of the 2025-cycle draft with Neo</w:t>
+        <w:t xml:space="preserve">Budget</w:t>
+      </w:r>
+      <w:r>
+        <w:t xml:space="preserve">: no line duplicates what NY Life already funds. Cole should still confirm current market rate for the Peer Support Specialist role before this figure is finalized.</w:t>
       </w:r>
     </w:p>
     <w:p>
@@ -1373,13 +1197,10 @@
           <w:bCs/>
           <w:b/>
         </w:rPr>
-        <w:t xml:space="preserve">07.</w:t>
-      </w:r>
-      <w:r>
-        <w:t xml:space="preserve"> </w:t>
-      </w:r>
-      <w:r>
-        <w:t xml:space="preserve">[x] Peace Garden launch year (2021) and Peace Garden feasibility are no longer load-bearing for this submission since the anchor program changed; kept on file in the superseded narrative source only</w:t>
+        <w:t xml:space="preserve">Leadership Learning Series topic list</w:t>
+      </w:r>
+      <w:r>
+        <w:t xml:space="preserve">: carried over from the 2025-cycle application; confirm these still reflect current priorities before submitting.</w:t>
       </w:r>
     </w:p>
     <w:p>
@@ -1395,245 +1216,7 @@
           <w:bCs/>
           <w:b/>
         </w:rPr>
-        <w:t xml:space="preserve">08.</w:t>
-      </w:r>
-      <w:r>
-        <w:t xml:space="preserve"> </w:t>
-      </w:r>
-      <w:r>
-        <w:t xml:space="preserve">[ ] CASEL, TBRI, and DESSA Mini claims, plus the</w:t>
-      </w:r>
-      <w:r>
-        <w:t xml:space="preserve"> </w:t>
-      </w:r>
-      <w:r>
-        <w:t xml:space="preserve">“</w:t>
-      </w:r>
-      <w:r>
-        <w:t xml:space="preserve">120 youth / 90% / 80%</w:t>
-      </w:r>
-      <w:r>
-        <w:t xml:space="preserve">”</w:t>
-      </w:r>
-      <w:r>
-        <w:t xml:space="preserve"> </w:t>
-      </w:r>
-      <w:r>
-        <w:t xml:space="preserve">FY2024 figures, are carried over from GOODProjects’ own 2025-cycle application, not independently verified against</w:t>
-      </w:r>
-      <w:r>
-        <w:t xml:space="preserve"> </w:t>
-      </w:r>
-      <w:r>
-        <w:rPr>
-          <w:rStyle w:val="VerbatimChar"/>
-        </w:rPr>
-        <w:t xml:space="preserve">org_profile</w:t>
-      </w:r>
-      <w:r>
-        <w:t xml:space="preserve">. Confirm with Stephanie Page-Baxter or whoever oversees the licensed clinical social worker role before submission, and get updated FY2025/FY2026 numbers if available</w:t>
-      </w:r>
-    </w:p>
-    <w:p>
-      <w:pPr>
-        <w:numPr>
-          <w:ilvl w:val="0"/>
-          <w:numId w:val="1001"/>
-        </w:numPr>
-        <w:pStyle w:val="Compact"/>
-      </w:pPr>
-      <w:r>
-        <w:rPr>
-          <w:bCs/>
-          <w:b/>
-        </w:rPr>
-        <w:t xml:space="preserve">09.</w:t>
-      </w:r>
-      <w:r>
-        <w:t xml:space="preserve"> </w:t>
-      </w:r>
-      <w:r>
-        <w:t xml:space="preserve">[ ]</w:t>
-      </w:r>
-      <w:r>
-        <w:t xml:space="preserve"> </w:t>
-      </w:r>
-      <w:r>
-        <w:t xml:space="preserve">“</w:t>
-      </w:r>
-      <w:r>
-        <w:t xml:space="preserve">Is this new, piloted, or existing</w:t>
-      </w:r>
-      <w:r>
-        <w:t xml:space="preserve">”</w:t>
-      </w:r>
-      <w:r>
-        <w:t xml:space="preserve"> </w:t>
-      </w:r>
-      <w:r>
-        <w:t xml:space="preserve">and</w:t>
-      </w:r>
-      <w:r>
-        <w:t xml:space="preserve"> </w:t>
-      </w:r>
-      <w:r>
-        <w:t xml:space="preserve">“</w:t>
-      </w:r>
-      <w:r>
-        <w:t xml:space="preserve">Applied before</w:t>
-      </w:r>
-      <w:r>
-        <w:t xml:space="preserve">”</w:t>
-      </w:r>
-      <w:r>
-        <w:t xml:space="preserve"> </w:t>
-      </w:r>
-      <w:r>
-        <w:t xml:space="preserve">answers assume the 2025 cycle draft was submitted but not awarded; confirm actual submission status with Neo</w:t>
-      </w:r>
-    </w:p>
-    <w:p>
-      <w:pPr>
-        <w:numPr>
-          <w:ilvl w:val="0"/>
-          <w:numId w:val="1001"/>
-        </w:numPr>
-        <w:pStyle w:val="Compact"/>
-      </w:pPr>
-      <w:r>
-        <w:rPr>
-          <w:bCs/>
-          <w:b/>
-        </w:rPr>
-        <w:t xml:space="preserve">10.</w:t>
-      </w:r>
-      <w:r>
-        <w:t xml:space="preserve"> </w:t>
-      </w:r>
-      <w:r>
-        <w:t xml:space="preserve">[ ] Next Gen Innovation Award eligibility (Darius under 32) is contradicted between this application (assumes over 32) and the 2025-cycle draft (assumed under 32, now a year older); confirm his current age against the threshold before choosing an award category</w:t>
-      </w:r>
-    </w:p>
-    <w:p>
-      <w:pPr>
-        <w:numPr>
-          <w:ilvl w:val="0"/>
-          <w:numId w:val="1001"/>
-        </w:numPr>
-        <w:pStyle w:val="Compact"/>
-      </w:pPr>
-      <w:r>
-        <w:rPr>
-          <w:bCs/>
-          <w:b/>
-        </w:rPr>
-        <w:t xml:space="preserve">11.</w:t>
-      </w:r>
-      <w:r>
-        <w:t xml:space="preserve"> </w:t>
-      </w:r>
-      <w:r>
-        <w:t xml:space="preserve">[x] No Cara Adams anywhere; Contact Person and all staffing references use current roster</w:t>
-      </w:r>
-    </w:p>
-    <w:p>
-      <w:pPr>
-        <w:numPr>
-          <w:ilvl w:val="0"/>
-          <w:numId w:val="1001"/>
-        </w:numPr>
-        <w:pStyle w:val="Compact"/>
-      </w:pPr>
-      <w:r>
-        <w:rPr>
-          <w:bCs/>
-          <w:b/>
-        </w:rPr>
-        <w:t xml:space="preserve">12.</w:t>
-      </w:r>
-      <w:r>
-        <w:t xml:space="preserve"> </w:t>
-      </w:r>
-      <w:r>
-        <w:t xml:space="preserve">[x] No em or en dashes anywhere in the final text</w:t>
-      </w:r>
-    </w:p>
-    <w:p>
-      <w:pPr>
-        <w:numPr>
-          <w:ilvl w:val="0"/>
-          <w:numId w:val="1001"/>
-        </w:numPr>
-        <w:pStyle w:val="Compact"/>
-      </w:pPr>
-      <w:r>
-        <w:rPr>
-          <w:bCs/>
-          <w:b/>
-        </w:rPr>
-        <w:t xml:space="preserve">13.</w:t>
-      </w:r>
-      <w:r>
-        <w:t xml:space="preserve"> </w:t>
-      </w:r>
-      <w:r>
-        <w:t xml:space="preserve">[x] No chatbot framing, no significance inflation, no vague attributions</w:t>
-      </w:r>
-    </w:p>
-    <w:p>
-      <w:pPr>
-        <w:numPr>
-          <w:ilvl w:val="0"/>
-          <w:numId w:val="1001"/>
-        </w:numPr>
-        <w:pStyle w:val="Compact"/>
-      </w:pPr>
-      <w:r>
-        <w:rPr>
-          <w:bCs/>
-          <w:b/>
-        </w:rPr>
-        <w:t xml:space="preserve">14.</w:t>
-      </w:r>
-      <w:r>
-        <w:t xml:space="preserve"> </w:t>
-      </w:r>
-      <w:r>
-        <w:t xml:space="preserve">[ ] Darius Baxter has not yet signed/approved; route through Neo first</w:t>
-      </w:r>
-    </w:p>
-    <w:p>
-      <w:pPr>
-        <w:numPr>
-          <w:ilvl w:val="0"/>
-          <w:numId w:val="1001"/>
-        </w:numPr>
-        <w:pStyle w:val="Compact"/>
-      </w:pPr>
-      <w:r>
-        <w:rPr>
-          <w:bCs/>
-          <w:b/>
-        </w:rPr>
-        <w:t xml:space="preserve">15.</w:t>
-      </w:r>
-      <w:r>
-        <w:t xml:space="preserve"> </w:t>
-      </w:r>
-      <w:r>
-        <w:t xml:space="preserve">[x] PDF generated:</w:t>
-      </w:r>
-      <w:r>
-        <w:t xml:space="preserve"> </w:t>
-      </w:r>
-      <w:r>
-        <w:rPr>
-          <w:rStyle w:val="VerbatimChar"/>
-        </w:rPr>
-        <w:t xml:space="preserve">2026-07-morgan-stanley-application-answers.pdf</w:t>
-      </w:r>
-      <w:r>
-        <w:t xml:space="preserve">. Regenerate after Neo’s review and any edits to the flagged items above</w:t>
+        <w:t xml:space="preserve">Darius Baxter has not yet signed or approved this application; route through Neo first.</w:t>
       </w:r>
     </w:p>
     <w:p>

</xml_diff>